<commit_message>
se elimina por completo cesion total de el formulario doblada. Se opta por dejar cesion parcial
</commit_message>
<xml_diff>
--- a/instructivos/pendientes a solucionar.docx
+++ b/instructivos/pendientes a solucionar.docx
@@ -49,30 +49,14 @@
     <w:p/>
     <w:p>
       <w:r>
-        <w:t xml:space="preserve">- si yo doblo un </w:t>
-      </w:r>
-      <w:proofErr w:type="gramStart"/>
-      <w:r>
-        <w:t>domingo ,</w:t>
-      </w:r>
-      <w:proofErr w:type="gramEnd"/>
-      <w:r>
-        <w:t xml:space="preserve"> tengo que doblar ese domingo. debemos quedar con la misma cantidad de domingo ese mismo mes.</w:t>
-      </w:r>
-    </w:p>
-    <w:p/>
-    <w:p/>
-    <w:p>
-      <w:r>
-        <w:t xml:space="preserve">- Cuando el mes tiene 5 domingos no deben quedar con </w:t>
-      </w:r>
-      <w:proofErr w:type="gramStart"/>
-      <w:r>
-        <w:t>los misma cantidad</w:t>
-      </w:r>
-      <w:proofErr w:type="gramEnd"/>
-      <w:r>
-        <w:t xml:space="preserve"> de domingo.</w:t>
+        <w:t>- si yo doblo un domingo , tengo que doblar ese domingo. debemos quedar con la misma cantidad de domingo ese mismo mes.</w:t>
+      </w:r>
+    </w:p>
+    <w:p/>
+    <w:p/>
+    <w:p>
+      <w:r>
+        <w:t>- Cuando el mes tiene 5 domingos no deben quedar con los misma cantidad de domingo.</w:t>
       </w:r>
     </w:p>
     <w:p/>
@@ -87,37 +71,13 @@
     <w:p>
       <w:r>
         <w:lastRenderedPageBreak/>
-        <w:t xml:space="preserve">- Cuando trabajan fines de semana no quedan debiendo 30 minutos. solo se debe cuando cambian un sábado con un </w:t>
-      </w:r>
-      <w:proofErr w:type="spellStart"/>
-      <w:r>
-        <w:t>dia</w:t>
-      </w:r>
-      <w:proofErr w:type="spellEnd"/>
-      <w:r>
-        <w:t xml:space="preserve"> de semana.  </w:t>
-      </w:r>
-    </w:p>
-    <w:p/>
-    <w:p>
-      <w:r>
-        <w:t xml:space="preserve">- los mediadores trabajan los </w:t>
-      </w:r>
-      <w:proofErr w:type="spellStart"/>
-      <w:r>
-        <w:t>dia</w:t>
-      </w:r>
-      <w:proofErr w:type="spellEnd"/>
-      <w:r>
-        <w:t xml:space="preserve"> de fin de semana intercalado. es </w:t>
-      </w:r>
-      <w:proofErr w:type="gramStart"/>
-      <w:r>
-        <w:t>decir</w:t>
-      </w:r>
-      <w:proofErr w:type="gramEnd"/>
-      <w:r>
-        <w:t xml:space="preserve"> si el primer fin de semana la jornada am trabaja el sábado el otro fin de semana trabaja el domingo(am)</w:t>
+        <w:t xml:space="preserve">- Cuando trabajan fines de semana no quedan debiendo 30 minutos. solo se debe cuando cambian un sábado con un dia de semana.  </w:t>
+      </w:r>
+    </w:p>
+    <w:p/>
+    <w:p>
+      <w:r>
+        <w:t>- los mediadores trabajan los dia de fin de semana intercalado. es decir si el primer fin de semana la jornada am trabaja el sábado el otro fin de semana trabaja el domingo(am)</w:t>
       </w:r>
     </w:p>
     <w:p/>
@@ -129,23 +89,7 @@
     <w:p/>
     <w:p>
       <w:r>
-        <w:t xml:space="preserve">- Cuando no es temporada el explorador descansa un </w:t>
-      </w:r>
-      <w:proofErr w:type="spellStart"/>
-      <w:r>
-        <w:t>dia</w:t>
-      </w:r>
-      <w:proofErr w:type="spellEnd"/>
-      <w:r>
-        <w:t xml:space="preserve"> del fin de semana y el primer día hábil de la </w:t>
-      </w:r>
-      <w:proofErr w:type="gramStart"/>
-      <w:r>
-        <w:t>semana</w:t>
-      </w:r>
-      <w:proofErr w:type="gramEnd"/>
-      <w:r>
-        <w:t xml:space="preserve"> pero cuando es temporada alta. EL lunes no hay mantenimiento entonces se rotan los días de descanso de la jornada am y pm de la semana, una jornada descansa el lunes y la otra descansa el viernes. Sí el lunes es festivo, esa jornada descansa el martes.</w:t>
+        <w:t>- Cuando no es temporada el explorador descansa un dia del fin de semana y el primer día hábil de la semana pero cuando es temporada alta. EL lunes no hay mantenimiento entonces se rotan los días de descanso de la jornada am y pm de la semana, una jornada descansa el lunes y la otra descansa el viernes. Sí el lunes es festivo, esa jornada descansa el martes.</w:t>
       </w:r>
     </w:p>
     <w:p/>
@@ -181,21 +125,19 @@
         <w:rPr>
           <w:highlight w:val="green"/>
         </w:rPr>
-        <w:t xml:space="preserve">. pues esto </w:t>
-      </w:r>
-      <w:proofErr w:type="gramStart"/>
+        <w:t xml:space="preserve">. pues esto ya que si yo como emisor debo pagar el </w:t>
+      </w:r>
       <w:r>
         <w:rPr>
           <w:highlight w:val="green"/>
         </w:rPr>
-        <w:t>ya que</w:t>
-      </w:r>
-      <w:proofErr w:type="gramEnd"/>
+        <w:t>sábado</w:t>
+      </w:r>
       <w:r>
         <w:rPr>
           <w:highlight w:val="green"/>
         </w:rPr>
-        <w:t xml:space="preserve"> si yo como emisor debo pagar el </w:t>
+        <w:t xml:space="preserve"> y si ese </w:t>
       </w:r>
       <w:r>
         <w:rPr>
@@ -207,102 +149,26 @@
         <w:rPr>
           <w:highlight w:val="green"/>
         </w:rPr>
-        <w:t xml:space="preserve"> y si ese </w:t>
+        <w:t xml:space="preserve"> no trabajo</w:t>
       </w:r>
       <w:r>
         <w:rPr>
           <w:highlight w:val="green"/>
         </w:rPr>
-        <w:t>sábado</w:t>
+        <w:t>,</w:t>
       </w:r>
       <w:r>
         <w:rPr>
           <w:highlight w:val="green"/>
         </w:rPr>
-        <w:t xml:space="preserve"> no trabajo</w:t>
-      </w:r>
-      <w:r>
-        <w:rPr>
-          <w:highlight w:val="green"/>
-        </w:rPr>
-        <w:t>,</w:t>
-      </w:r>
-      <w:r>
-        <w:rPr>
-          <w:highlight w:val="green"/>
-        </w:rPr>
-        <w:t xml:space="preserve"> tengo todo el día libre y por ende voy a pagar la jornada que debo, entonces se puede seleccionar si cubre solo la am o solo la pm o si cubre </w:t>
-      </w:r>
-      <w:proofErr w:type="gramStart"/>
-      <w:r>
-        <w:rPr>
-          <w:highlight w:val="green"/>
-        </w:rPr>
-        <w:t>ambas</w:t>
-      </w:r>
-      <w:proofErr w:type="gramEnd"/>
-      <w:r>
-        <w:rPr>
-          <w:highlight w:val="green"/>
-        </w:rPr>
-        <w:t xml:space="preserve"> pero si cubre ambas entonces el del turno del </w:t>
-      </w:r>
-      <w:proofErr w:type="spellStart"/>
-      <w:r>
-        <w:rPr>
-          <w:highlight w:val="green"/>
-        </w:rPr>
-        <w:t>sabado</w:t>
-      </w:r>
-      <w:proofErr w:type="spellEnd"/>
-      <w:r>
-        <w:rPr>
-          <w:highlight w:val="green"/>
-        </w:rPr>
-        <w:t xml:space="preserve"> no </w:t>
-      </w:r>
-      <w:proofErr w:type="spellStart"/>
-      <w:r>
-        <w:rPr>
-          <w:highlight w:val="green"/>
-        </w:rPr>
-        <w:t>iria</w:t>
-      </w:r>
-      <w:proofErr w:type="spellEnd"/>
-      <w:r>
-        <w:rPr>
-          <w:highlight w:val="green"/>
-        </w:rPr>
-        <w:t xml:space="preserve"> ese </w:t>
-      </w:r>
-      <w:proofErr w:type="spellStart"/>
-      <w:r>
-        <w:rPr>
-          <w:highlight w:val="green"/>
-        </w:rPr>
-        <w:t>sabado</w:t>
-      </w:r>
-      <w:proofErr w:type="spellEnd"/>
-      <w:r>
-        <w:rPr>
-          <w:highlight w:val="green"/>
-        </w:rPr>
-        <w:t xml:space="preserve"> y me queda debiendo media jornada</w:t>
-      </w:r>
-    </w:p>
-    <w:p/>
-    <w:p/>
-    <w:p>
-      <w:r>
-        <w:t xml:space="preserve">validar que en </w:t>
-      </w:r>
-      <w:proofErr w:type="gramStart"/>
-      <w:r>
-        <w:t>doblada  normal</w:t>
-      </w:r>
-      <w:proofErr w:type="gramEnd"/>
-      <w:r>
-        <w:t xml:space="preserve"> no se permita sábado por sábado </w:t>
+        <w:t xml:space="preserve"> tengo todo el día libre y por ende voy a pagar la jornada que debo, entonces se puede seleccionar si cubre solo la am o solo la pm o si cubre ambas pero si cubre ambas entonces el del turno del sabado no iria ese sabado y me queda debiendo media jornada</w:t>
+      </w:r>
+    </w:p>
+    <w:p/>
+    <w:p/>
+    <w:p>
+      <w:r>
+        <w:t xml:space="preserve">validar que en doblada  normal no se permita sábado por sábado </w:t>
       </w:r>
     </w:p>
     <w:p/>
@@ -310,15 +176,7 @@
     <w:p>
       <w:r>
         <w:lastRenderedPageBreak/>
-        <w:t xml:space="preserve">Que reglas hay para </w:t>
-      </w:r>
-      <w:proofErr w:type="gramStart"/>
-      <w:r>
-        <w:t>los festivo</w:t>
-      </w:r>
-      <w:proofErr w:type="gramEnd"/>
-      <w:r>
-        <w:t xml:space="preserve">. Se que hay algo en que solo puede ser si hay dos festivos dentro del mismo mes, creo que son cambio de turnos </w:t>
+        <w:t xml:space="preserve">Que reglas hay para los festivo. Se que hay algo en que solo puede ser si hay dos festivos dentro del mismo mes, creo que son cambio de turnos </w:t>
       </w:r>
     </w:p>
     <w:p/>
@@ -334,107 +192,16 @@
         <w:rPr>
           <w:highlight w:val="yellow"/>
         </w:rPr>
-        <w:t xml:space="preserve">Cuando se realiza la doblada de un día de semana por un sábado se queda debiendo los 30 minutos tanto si </w:t>
-      </w:r>
-      <w:proofErr w:type="gramStart"/>
-      <w:r>
-        <w:rPr>
-          <w:highlight w:val="yellow"/>
-        </w:rPr>
-        <w:t>tu doblas</w:t>
-      </w:r>
-      <w:proofErr w:type="gramEnd"/>
-      <w:r>
-        <w:rPr>
-          <w:highlight w:val="yellow"/>
-        </w:rPr>
-        <w:t xml:space="preserve"> el sábado o el día de </w:t>
-      </w:r>
-      <w:proofErr w:type="gramStart"/>
-      <w:r>
-        <w:rPr>
-          <w:highlight w:val="yellow"/>
-        </w:rPr>
-        <w:t>semana ?</w:t>
-      </w:r>
-      <w:proofErr w:type="gramEnd"/>
+        <w:t>Cuando se realiza la doblada de un día de semana por un sábado se queda debiendo los 30 minutos tanto si tu doblas el sábado o el día de semana ?</w:t>
+      </w:r>
     </w:p>
     <w:p/>
     <w:p>
       <w:pPr>
         <w:shd w:val="clear" w:color="auto" w:fill="FFFF00"/>
       </w:pPr>
-      <w:proofErr w:type="spellStart"/>
-      <w:r>
-        <w:t>si</w:t>
-      </w:r>
-      <w:proofErr w:type="spellEnd"/>
-      <w:r>
-        <w:t xml:space="preserve"> existe este </w:t>
-      </w:r>
-      <w:proofErr w:type="gramStart"/>
-      <w:r>
-        <w:t>caso</w:t>
-      </w:r>
-      <w:proofErr w:type="gramEnd"/>
-      <w:r>
-        <w:t xml:space="preserve"> por ejemplo. si una persona tiene un </w:t>
-      </w:r>
-      <w:proofErr w:type="spellStart"/>
-      <w:r>
-        <w:t>dia</w:t>
-      </w:r>
-      <w:proofErr w:type="spellEnd"/>
-      <w:r>
-        <w:t xml:space="preserve"> libre y le mandan una solicitud. donde una persona solo tiene una jornada am o </w:t>
-      </w:r>
-      <w:proofErr w:type="gramStart"/>
-      <w:r>
-        <w:t>pm .</w:t>
-      </w:r>
-      <w:proofErr w:type="gramEnd"/>
-      <w:r>
-        <w:t xml:space="preserve"> puede realizar el cambio y el que </w:t>
-      </w:r>
-      <w:proofErr w:type="spellStart"/>
-      <w:r>
-        <w:t>esta</w:t>
-      </w:r>
-      <w:proofErr w:type="spellEnd"/>
-      <w:r>
-        <w:t xml:space="preserve"> libre puede ir a trabajar esa </w:t>
-      </w:r>
-      <w:proofErr w:type="spellStart"/>
-      <w:r>
-        <w:t>jornda</w:t>
-      </w:r>
-      <w:proofErr w:type="spellEnd"/>
-      <w:r>
-        <w:t xml:space="preserve"> y </w:t>
-      </w:r>
-      <w:proofErr w:type="spellStart"/>
-      <w:r>
-        <w:t>despues</w:t>
-      </w:r>
-      <w:proofErr w:type="spellEnd"/>
-      <w:r>
-        <w:t xml:space="preserve"> el solicitante debe pagar esa jornada. donde consideras que este tipo de solicitud donde </w:t>
-      </w:r>
-      <w:proofErr w:type="spellStart"/>
-      <w:r>
-        <w:t>deberia</w:t>
-      </w:r>
-      <w:proofErr w:type="spellEnd"/>
-      <w:r>
-        <w:t xml:space="preserve"> </w:t>
-      </w:r>
-      <w:proofErr w:type="gramStart"/>
-      <w:r>
-        <w:t>ir ?</w:t>
-      </w:r>
-      <w:proofErr w:type="gramEnd"/>
-      <w:r>
-        <w:t xml:space="preserve"> de todos los tipos de solicitudes que tenemos</w:t>
+      <w:r>
+        <w:t>si existe este caso por ejemplo. si una persona tiene un dia libre y le mandan una solicitud. donde una persona solo tiene una jornada am o pm . puede realizar el cambio y el que esta libre puede ir a trabajar esa jornda y despues el solicitante debe pagar esa jornada. donde consideras que este tipo de solicitud donde deberia ir ? de todos los tipos de solicitudes que tenemos</w:t>
       </w:r>
     </w:p>
     <w:p>
@@ -459,21 +226,7 @@
         <w:rPr>
           <w:u w:val="single"/>
         </w:rPr>
-        <w:t xml:space="preserve">rango de </w:t>
-      </w:r>
-      <w:proofErr w:type="gramStart"/>
-      <w:r>
-        <w:rPr>
-          <w:u w:val="single"/>
-        </w:rPr>
-        <w:t>días  sanciones</w:t>
-      </w:r>
-      <w:proofErr w:type="gramEnd"/>
-      <w:r>
-        <w:rPr>
-          <w:u w:val="single"/>
-        </w:rPr>
-        <w:t xml:space="preserve"> las pone el supervisor </w:t>
+        <w:t xml:space="preserve">rango de días  sanciones las pone el supervisor </w:t>
       </w:r>
     </w:p>
     <w:p>
@@ -594,24 +347,8 @@
         <w:rPr>
           <w:u w:val="single"/>
         </w:rPr>
-        <w:t xml:space="preserve">de semana a sábado. generar media hora emisor y receptor (d </w:t>
-      </w:r>
-      <w:proofErr w:type="spellStart"/>
-      <w:proofErr w:type="gramStart"/>
-      <w:r>
-        <w:rPr>
-          <w:u w:val="single"/>
-        </w:rPr>
-        <w:t>permanete</w:t>
-      </w:r>
-      <w:proofErr w:type="spellEnd"/>
-      <w:r>
-        <w:rPr>
-          <w:u w:val="single"/>
-        </w:rPr>
-        <w:t xml:space="preserve"> )</w:t>
-      </w:r>
-      <w:proofErr w:type="gramEnd"/>
+        <w:t>de semana a sábado. generar media hora emisor y receptor (d permanete )</w:t>
+      </w:r>
     </w:p>
     <w:p>
       <w:pPr>
@@ -649,21 +386,7 @@
         <w:rPr>
           <w:u w:val="single"/>
         </w:rPr>
-        <w:t xml:space="preserve">la sesión de mis turnos que aparezca solo el registro de las personas que </w:t>
-      </w:r>
-      <w:proofErr w:type="spellStart"/>
-      <w:r>
-        <w:rPr>
-          <w:u w:val="single"/>
-        </w:rPr>
-        <w:t>realizaorn</w:t>
-      </w:r>
-      <w:proofErr w:type="spellEnd"/>
-      <w:r>
-        <w:rPr>
-          <w:u w:val="single"/>
-        </w:rPr>
-        <w:t xml:space="preserve"> movimientos de cambio de turno</w:t>
+        <w:t>la sesión de mis turnos que aparezca solo el registro de las personas que realizaorn movimientos de cambio de turno</w:t>
       </w:r>
     </w:p>
     <w:p>
@@ -699,35 +422,7 @@
         <w:rPr>
           <w:u w:val="single"/>
         </w:rPr>
-        <w:t xml:space="preserve">Revisa porque no se </w:t>
-      </w:r>
-      <w:proofErr w:type="spellStart"/>
-      <w:r>
-        <w:rPr>
-          <w:u w:val="single"/>
-        </w:rPr>
-        <w:t>genero</w:t>
-      </w:r>
-      <w:proofErr w:type="spellEnd"/>
-      <w:r>
-        <w:rPr>
-          <w:u w:val="single"/>
-        </w:rPr>
-        <w:t xml:space="preserve"> el acumulado de viernes a sábado debió </w:t>
-      </w:r>
-      <w:proofErr w:type="spellStart"/>
-      <w:r>
-        <w:rPr>
-          <w:u w:val="single"/>
-        </w:rPr>
-        <w:t>acomular</w:t>
-      </w:r>
-      <w:proofErr w:type="spellEnd"/>
-      <w:r>
-        <w:rPr>
-          <w:u w:val="single"/>
-        </w:rPr>
-        <w:t xml:space="preserve"> 30 minutos </w:t>
+        <w:t xml:space="preserve">Revisa porque no se genero el acumulado de viernes a sábado debió acomular 30 minutos </w:t>
       </w:r>
     </w:p>
     <w:p>
@@ -794,77 +489,19 @@
           <w:highlight w:val="magenta"/>
         </w:rPr>
       </w:pPr>
-      <w:proofErr w:type="spellStart"/>
       <w:r>
         <w:rPr>
           <w:highlight w:val="magenta"/>
         </w:rPr>
-        <w:t>python</w:t>
-      </w:r>
-      <w:proofErr w:type="spellEnd"/>
+        <w:t>python manage.py cancelar_deudas_fin_semana --dry-run   # revisar</w:t>
+      </w:r>
+    </w:p>
+    <w:p>
       <w:r>
         <w:rPr>
           <w:highlight w:val="magenta"/>
         </w:rPr>
-        <w:t xml:space="preserve"> manage.py </w:t>
-      </w:r>
-      <w:proofErr w:type="spellStart"/>
-      <w:r>
-        <w:rPr>
-          <w:highlight w:val="magenta"/>
-        </w:rPr>
-        <w:t>cancelar_deudas_fin_semana</w:t>
-      </w:r>
-      <w:proofErr w:type="spellEnd"/>
-      <w:r>
-        <w:rPr>
-          <w:highlight w:val="magenta"/>
-        </w:rPr>
-        <w:t xml:space="preserve"> --</w:t>
-      </w:r>
-      <w:proofErr w:type="spellStart"/>
-      <w:r>
-        <w:rPr>
-          <w:highlight w:val="magenta"/>
-        </w:rPr>
-        <w:t>dry</w:t>
-      </w:r>
-      <w:proofErr w:type="spellEnd"/>
-      <w:r>
-        <w:rPr>
-          <w:highlight w:val="magenta"/>
-        </w:rPr>
-        <w:t>-run   # revisar</w:t>
-      </w:r>
-    </w:p>
-    <w:p>
-      <w:proofErr w:type="spellStart"/>
-      <w:r>
-        <w:rPr>
-          <w:highlight w:val="magenta"/>
-        </w:rPr>
-        <w:t>python</w:t>
-      </w:r>
-      <w:proofErr w:type="spellEnd"/>
-      <w:r>
-        <w:rPr>
-          <w:highlight w:val="magenta"/>
-        </w:rPr>
-        <w:t xml:space="preserve"> manage.py </w:t>
-      </w:r>
-      <w:proofErr w:type="spellStart"/>
-      <w:r>
-        <w:rPr>
-          <w:highlight w:val="magenta"/>
-        </w:rPr>
-        <w:t>cancelar_deudas_fin_semana</w:t>
-      </w:r>
-      <w:proofErr w:type="spellEnd"/>
-      <w:r>
-        <w:rPr>
-          <w:highlight w:val="magenta"/>
-        </w:rPr>
-        <w:t xml:space="preserve">             # aplicar</w:t>
+        <w:t>python manage.py cancelar_deudas_fin_semana             # aplicar</w:t>
       </w:r>
     </w:p>
     <w:p/>
@@ -904,119 +541,29 @@
           <w:highlight w:val="magenta"/>
         </w:rPr>
       </w:pPr>
-      <w:proofErr w:type="spellStart"/>
       <w:r>
         <w:rPr>
           <w:highlight w:val="magenta"/>
         </w:rPr>
-        <w:t>python</w:t>
-      </w:r>
-      <w:proofErr w:type="spellEnd"/>
+        <w:t>python manage.py cancelar_deudas_huerfanas --dry-run</w:t>
+      </w:r>
+    </w:p>
+    <w:p>
       <w:r>
         <w:rPr>
           <w:highlight w:val="magenta"/>
         </w:rPr>
-        <w:t xml:space="preserve"> manage.py </w:t>
-      </w:r>
-      <w:proofErr w:type="spellStart"/>
+        <w:t>python manage.py cancelar_deudas_huerfanas</w:t>
+      </w:r>
+    </w:p>
+    <w:p/>
+    <w:p>
       <w:r>
         <w:rPr>
           <w:highlight w:val="magenta"/>
         </w:rPr>
-        <w:t>cancelar_deudas_huerfanas</w:t>
-      </w:r>
-      <w:proofErr w:type="spellEnd"/>
-      <w:r>
-        <w:rPr>
-          <w:highlight w:val="magenta"/>
-        </w:rPr>
-        <w:t xml:space="preserve"> --</w:t>
-      </w:r>
-      <w:proofErr w:type="spellStart"/>
-      <w:r>
-        <w:rPr>
-          <w:highlight w:val="magenta"/>
-        </w:rPr>
-        <w:t>dry</w:t>
-      </w:r>
-      <w:proofErr w:type="spellEnd"/>
-      <w:r>
-        <w:rPr>
-          <w:highlight w:val="magenta"/>
-        </w:rPr>
-        <w:t>-run</w:t>
-      </w:r>
-    </w:p>
-    <w:p>
-      <w:proofErr w:type="spellStart"/>
-      <w:r>
-        <w:rPr>
-          <w:highlight w:val="magenta"/>
-        </w:rPr>
-        <w:t>python</w:t>
-      </w:r>
-      <w:proofErr w:type="spellEnd"/>
-      <w:r>
-        <w:rPr>
-          <w:highlight w:val="magenta"/>
-        </w:rPr>
-        <w:t xml:space="preserve"> manage.py </w:t>
-      </w:r>
-      <w:proofErr w:type="spellStart"/>
-      <w:r>
-        <w:rPr>
-          <w:highlight w:val="magenta"/>
-        </w:rPr>
-        <w:t>cancelar_deudas_huerfanas</w:t>
-      </w:r>
-      <w:proofErr w:type="spellEnd"/>
-    </w:p>
-    <w:p/>
-    <w:p>
-      <w:proofErr w:type="spellStart"/>
-      <w:r>
-        <w:rPr>
-          <w:highlight w:val="magenta"/>
-        </w:rPr>
-        <w:t>python</w:t>
-      </w:r>
-      <w:proofErr w:type="spellEnd"/>
-      <w:r>
-        <w:rPr>
-          <w:highlight w:val="magenta"/>
-        </w:rPr>
-        <w:t xml:space="preserve"> manage.py </w:t>
-      </w:r>
-      <w:proofErr w:type="spellStart"/>
-      <w:proofErr w:type="gramStart"/>
-      <w:r>
-        <w:rPr>
-          <w:highlight w:val="magenta"/>
-        </w:rPr>
-        <w:t>migrate</w:t>
-      </w:r>
-      <w:proofErr w:type="spellEnd"/>
-      <w:r>
-        <w:rPr>
-          <w:highlight w:val="magenta"/>
-        </w:rPr>
-        <w:t xml:space="preserve"> :</w:t>
-      </w:r>
-      <w:proofErr w:type="gramEnd"/>
-      <w:r>
-        <w:rPr>
-          <w:highlight w:val="magenta"/>
-        </w:rPr>
-        <w:t xml:space="preserve"> independientemente si se elimina o no los datos de la </w:t>
-      </w:r>
-      <w:proofErr w:type="spellStart"/>
-      <w:r>
-        <w:rPr>
-          <w:highlight w:val="magenta"/>
-        </w:rPr>
-        <w:t>bd</w:t>
-      </w:r>
-      <w:proofErr w:type="spellEnd"/>
+        <w:t>python manage.py migrate : independientemente si se elimina o no los datos de la bd</w:t>
+      </w:r>
     </w:p>
     <w:p/>
     <w:p>
@@ -1028,23 +575,7 @@
         </w:numPr>
       </w:pPr>
       <w:r>
-        <w:t xml:space="preserve">Organizar en </w:t>
-      </w:r>
-      <w:proofErr w:type="gramStart"/>
-      <w:r>
-        <w:t>todos la alternancia</w:t>
-      </w:r>
-      <w:proofErr w:type="gramEnd"/>
-      <w:r>
-        <w:t xml:space="preserve"> de descanso y trabajo de los fines de semana. En </w:t>
-      </w:r>
-      <w:proofErr w:type="gramStart"/>
-      <w:r>
-        <w:t>solicitudes  permanentes</w:t>
-      </w:r>
-      <w:proofErr w:type="gramEnd"/>
-      <w:r>
-        <w:t xml:space="preserve"> también </w:t>
+        <w:t xml:space="preserve">Organizar en todos la alternancia de descanso y trabajo de los fines de semana. En solicitudes  permanentes también </w:t>
       </w:r>
     </w:p>
     <w:p>
@@ -1070,23 +601,7 @@
       </w:pPr>
       <w:r>
         <w:lastRenderedPageBreak/>
-        <w:t xml:space="preserve">Los días festivos también se alternan </w:t>
-      </w:r>
-      <w:proofErr w:type="gramStart"/>
-      <w:r>
-        <w:t>la jornadas</w:t>
-      </w:r>
-      <w:proofErr w:type="gramEnd"/>
-      <w:r>
-        <w:t xml:space="preserve"> para trabajar el día completo. Esa regla esta. Validar por favor porque en cambio de turno sencillo revise un día de eso y lo esta tomando como </w:t>
-      </w:r>
-      <w:proofErr w:type="gramStart"/>
-      <w:r>
-        <w:t>jornada predeterminado</w:t>
-      </w:r>
-      <w:proofErr w:type="gramEnd"/>
-      <w:r>
-        <w:t xml:space="preserve"> y debe tener en cuenta eso </w:t>
+        <w:t xml:space="preserve">Los días festivos también se alternan la jornadas para trabajar el día completo. Esa regla esta. Validar por favor porque en cambio de turno sencillo revise un día de eso y lo esta tomando como jornada predeterminado y debe tener en cuenta eso </w:t>
       </w:r>
     </w:p>
     <w:p>
@@ -1215,7 +730,6 @@
         </w:drawing>
       </w:r>
     </w:p>
-    <w:p/>
     <w:p>
       <w:pPr>
         <w:rPr>
@@ -1224,7 +738,41 @@
         </w:rPr>
       </w:pPr>
       <w:r>
-        <w:lastRenderedPageBreak/>
+        <w:rPr>
+          <w:b/>
+          <w:bCs/>
+        </w:rPr>
+        <w:t>Nota:</w:t>
+      </w:r>
+      <w:r>
+        <w:rPr>
+          <w:rFonts w:ascii="Segoe UI" w:hAnsi="Segoe UI" w:cs="Segoe UI"/>
+          <w:b/>
+          <w:bCs/>
+          <w:color w:val="CCCCCC"/>
+          <w:sz w:val="20"/>
+          <w:szCs w:val="20"/>
+          <w:shd w:val="clear" w:color="auto" w:fill="181818"/>
+        </w:rPr>
+        <w:t xml:space="preserve"> </w:t>
+      </w:r>
+      <w:r>
+        <w:rPr>
+          <w:b/>
+          <w:bCs/>
+        </w:rPr>
+        <w:t>Mismo patrón: al cambiar de fecha, queda visible el bloque "¿Qué cubrirás ese día?"</w:t>
+      </w:r>
+    </w:p>
+    <w:p/>
+    <w:p>
+      <w:pPr>
+        <w:rPr>
+          <w:b/>
+          <w:bCs/>
+        </w:rPr>
+      </w:pPr>
+      <w:r>
         <w:t xml:space="preserve">Nota: </w:t>
       </w:r>
       <w:r>
@@ -1271,6 +819,75 @@
       </w:r>
       <w:r>
         <w:t>. Nunca hay que borrar nada a mano.</w:t>
+      </w:r>
+    </w:p>
+    <w:p/>
+    <w:p>
+      <w:r>
+        <w:t xml:space="preserve">Si </w:t>
+      </w:r>
+      <w:proofErr w:type="spellStart"/>
+      <w:r>
+        <w:t>jhon</w:t>
+      </w:r>
+      <w:proofErr w:type="spellEnd"/>
+      <w:r>
+        <w:t xml:space="preserve"> y mariana envían una solicitud de cambio de día de descanso o cualquier otra </w:t>
+      </w:r>
+      <w:proofErr w:type="spellStart"/>
+      <w:r>
+        <w:t>solicitu</w:t>
+      </w:r>
+      <w:proofErr w:type="spellEnd"/>
+      <w:r>
+        <w:t xml:space="preserve"> a </w:t>
+      </w:r>
+      <w:proofErr w:type="spellStart"/>
+      <w:r>
+        <w:t>dina.gil</w:t>
+      </w:r>
+      <w:proofErr w:type="spellEnd"/>
+      <w:r>
+        <w:t xml:space="preserve"> y resulta que mariana y </w:t>
+      </w:r>
+      <w:proofErr w:type="spellStart"/>
+      <w:r>
+        <w:t>jhon</w:t>
+      </w:r>
+      <w:proofErr w:type="spellEnd"/>
+      <w:r>
+        <w:t xml:space="preserve"> solicitaron el mismo día a mariana, que pasaría en ese caso </w:t>
+      </w:r>
+    </w:p>
+    <w:p/>
+    <w:p>
+      <w:r>
+        <w:t>En semana cuando descansa</w:t>
+      </w:r>
+      <w:r>
+        <w:t xml:space="preserve"> por ser temporada alta</w:t>
+      </w:r>
+      <w:r>
+        <w:t xml:space="preserve">. </w:t>
+      </w:r>
+    </w:p>
+    <w:p>
+      <w:r>
+        <w:t xml:space="preserve">Se elije un </w:t>
+      </w:r>
+      <w:proofErr w:type="spellStart"/>
+      <w:r>
+        <w:t>dái</w:t>
+      </w:r>
+      <w:proofErr w:type="spellEnd"/>
+      <w:r>
+        <w:t xml:space="preserve"> para que descanse una jornada y otro día para la restante. </w:t>
+      </w:r>
+      <w:r>
+        <w:t>El martes el grupo am y el viernes el grupo pm</w:t>
+      </w:r>
+      <w:r>
+        <w:t xml:space="preserve"> pero en ese caso también doblarían ese día o como se haría porque en ese caso quedaría un hueco </w:t>
       </w:r>
     </w:p>
     <w:p/>

</xml_diff>